<commit_message>
Bao mat tao nhom: Bat buoc tim dung Username hoac ID, khong liet ke nguoi dung bua bai
</commit_message>
<xml_diff>
--- a/BÁO CÁO ĐỒ ÁN CHUYÊN NGÀNH - CHƯƠNG 5 - KẾT LUẬN - NHÓM 5.docx
+++ b/BÁO CÁO ĐỒ ÁN CHUYÊN NGÀNH - CHƯƠNG 5 - KẾT LUẬN - NHÓM 5.docx
@@ -1005,13 +1005,7 @@
         <w:jc w:val="left"/>
       </w:pPr>
       <w:r>
-        <w:rPr>
-          <w:rFonts w:ascii="Times New Roman" w:hAnsi="Times New Roman"/>
-          <w:b/>
-          <w:i w:val="0"/>
-          <w:sz w:val="27"/>
-        </w:rPr>
-        <w:t>5.2.4. Giao diện Hộp thoại Tạo nhóm chat mới</w:t>
+        <w:t>5.2.4. Giao diện Hộp thoại Tạo nhóm chat riêng tư (Bảo vệ quyền riêng tư)</w:t>
       </w:r>
     </w:p>
     <w:p>
@@ -1021,13 +1015,7 @@
         <w:jc w:val="both"/>
       </w:pPr>
       <w:r>
-        <w:rPr>
-          <w:rFonts w:ascii="Times New Roman" w:hAnsi="Times New Roman"/>
-          <w:b w:val="0"/>
-          <w:i w:val="0"/>
-          <w:sz w:val="26"/>
-        </w:rPr>
-        <w:t>Khi người dùng nhấn vào nút `➕ Tạo Nhóm Chat Mới` ở thanh sidebar, một cửa sổ dạng Modal sẽ bật lên cho phép nhập Tên nhóm chat và cung cấp danh sách Checkbox hiển thị toàn bộ bạn bè để tích chọn người tham gia. Sau khi tạo thành công, nhóm chat mới lập tức được đồng bộ theo thời gian thực tới tất cả các thành viên.</w:t>
+        <w:t>Khi người dùng nhấn nút '➕ Tạo Nhóm Chat Mới' ở thanh sidebar, một cửa sổ dạng Modal bảo mật sẽ bật lên: Người dùng nhập Tên nhóm chat và thêm thành viên bằng cách gõ chính xác Tên đăng nhập (Username) hoặc ID cá nhân của người muốn mời. Hệ thống kiểm tra và chỉ thêm khi người dùng tồn tại, hiển thị trực quan dưới dạng thẻ thành viên kèm nút '✕' xóa nhanh. Cơ chế này ngăn chặn tuyệt đối việc lộ danh sách người dùng toàn hệ thống và loại bỏ hoàn toàn hành vi kéo bừa người lạ vào nhóm.</w:t>
       </w:r>
     </w:p>
     <w:p>

</xml_diff>